<commit_message>
Mempercantik tampilan dashboard dan menyederhanakan form usulan & laporan insiden menjadi dua tahap saja agar ttd nya berfungsi
</commit_message>
<xml_diff>
--- a/templates/usulan_perubahan_template.docx
+++ b/templates/usulan_perubahan_template.docx
@@ -28,13 +28,12 @@
             <w:pPr>
               <w:jc w:val="center"/>
             </w:pPr>
-            <w:bookmarkStart w:id="0" w:name="_Hlk219889609"/>
             <w:r>
               <w:rPr>
                 <w:noProof/>
               </w:rPr>
               <w:drawing>
-                <wp:inline distT="0" distB="0" distL="0" distR="0" wp14:anchorId="6C4C53D0" wp14:editId="3945A94D">
+                <wp:inline distT="0" distB="0" distL="0" distR="0" wp14:anchorId="38512DD6" wp14:editId="1D583E24">
                   <wp:extent cx="619800" cy="768350"/>
                   <wp:effectExtent l="0" t="0" r="8890" b="0"/>
                   <wp:docPr id="1649622208" name="Gambar 1"/>
@@ -436,10 +435,7 @@
           <w:p>
             <w:proofErr w:type="gramStart"/>
             <w:r>
-              <w:t>{{</w:t>
-            </w:r>
-            <w:r>
-              <w:t xml:space="preserve"> </w:t>
+              <w:t xml:space="preserve">{{ </w:t>
             </w:r>
             <w:proofErr w:type="spellStart"/>
             <w:r>
@@ -447,17 +443,11 @@
             </w:r>
             <w:proofErr w:type="gramEnd"/>
             <w:r>
-              <w:t>_</w:t>
-            </w:r>
-            <w:r>
-              <w:t>usulan</w:t>
-            </w:r>
-            <w:proofErr w:type="spellEnd"/>
-            <w:r>
-              <w:t xml:space="preserve"> </w:t>
-            </w:r>
-            <w:r>
-              <w:t>}}</w:t>
+              <w:t>_usulan</w:t>
+            </w:r>
+            <w:proofErr w:type="spellEnd"/>
+            <w:r>
+              <w:t xml:space="preserve"> }}</w:t>
             </w:r>
           </w:p>
         </w:tc>
@@ -473,10 +463,7 @@
             </w:r>
             <w:proofErr w:type="spellEnd"/>
             <w:r>
-              <w:t>:</w:t>
-            </w:r>
-            <w:r>
-              <w:t xml:space="preserve"> </w:t>
+              <w:t xml:space="preserve">: </w:t>
             </w:r>
             <w:proofErr w:type="gramStart"/>
             <w:r>
@@ -575,7 +562,7 @@
         <w:trPr>
           <w:gridAfter w:val="1"/>
           <w:wAfter w:w="6" w:type="dxa"/>
-          <w:trHeight w:val="998"/>
+          <w:trHeight w:val="1281"/>
         </w:trPr>
         <w:tc>
           <w:tcPr>
@@ -721,7 +708,7 @@
         <w:trPr>
           <w:gridAfter w:val="1"/>
           <w:wAfter w:w="6" w:type="dxa"/>
-          <w:trHeight w:val="880"/>
+          <w:trHeight w:val="1545"/>
         </w:trPr>
         <w:tc>
           <w:tcPr>
@@ -782,6 +769,7 @@
               <w:t>}</w:t>
             </w:r>
           </w:p>
+          <w:p/>
           <w:p/>
         </w:tc>
       </w:tr>
@@ -1299,15 +1287,7 @@
                 <w:b/>
                 <w:bCs/>
               </w:rPr>
-              <w:t>is</w:t>
-            </w:r>
-            <w:r>
-              <w:rPr>
-                <w:rFonts w:ascii="Segoe UI Symbol" w:hAnsi="Segoe UI Symbol" w:cs="Segoe UI Symbol"/>
-                <w:b/>
-                <w:bCs/>
-              </w:rPr>
-              <w:t>_lainnya</w:t>
+              <w:t>is_lainnya</w:t>
             </w:r>
             <w:proofErr w:type="spellEnd"/>
             <w:r>
@@ -1618,16 +1598,7 @@
           </w:tcPr>
           <w:p>
             <w:r>
-              <w:t>Upaya / Tindakan</w:t>
-            </w:r>
-            <w:r>
-              <w:t xml:space="preserve"> y</w:t>
-            </w:r>
-            <w:r>
-              <w:t>ang</w:t>
-            </w:r>
-            <w:r>
-              <w:t xml:space="preserve"> </w:t>
+              <w:t xml:space="preserve">Upaya / Tindakan yang </w:t>
             </w:r>
             <w:proofErr w:type="spellStart"/>
             <w:r>
@@ -1893,6 +1864,7 @@
                 <w:b/>
                 <w:bCs/>
               </w:rPr>
+              <w:lastRenderedPageBreak/>
               <w:t xml:space="preserve">Status </w:t>
             </w:r>
             <w:proofErr w:type="spellStart"/>
@@ -2065,7 +2037,6 @@
           <w:p>
             <w:proofErr w:type="spellStart"/>
             <w:r>
-              <w:lastRenderedPageBreak/>
               <w:t>Tanggal</w:t>
             </w:r>
             <w:proofErr w:type="spellEnd"/>
@@ -2172,8 +2143,9 @@
       </w:tr>
     </w:tbl>
     <w:p/>
+    <w:p/>
     <w:p>
-      <w:bookmarkStart w:id="1" w:name="_Hlk216772573"/>
+      <w:bookmarkStart w:id="0" w:name="_Hlk216772573"/>
       <w:proofErr w:type="spellStart"/>
       <w:r>
         <w:t>Klasifikasi</w:t>
@@ -2211,6 +2183,7 @@
         <w:t>Hal: 1 / 1</w:t>
       </w:r>
     </w:p>
+    <w:p/>
     <w:tbl>
       <w:tblPr>
         <w:tblStyle w:val="KisiTabel"/>
@@ -2234,7 +2207,7 @@
             <w:tcW w:w="2547" w:type="dxa"/>
             <w:gridSpan w:val="2"/>
           </w:tcPr>
-          <w:bookmarkEnd w:id="1"/>
+          <w:bookmarkEnd w:id="0"/>
           <w:p>
             <w:r>
               <w:t xml:space="preserve">Tanda </w:t>
@@ -2499,10 +2472,7 @@
             </w:r>
             <w:proofErr w:type="spellStart"/>
             <w:r>
-              <w:t>t</w:t>
-            </w:r>
-            <w:r>
-              <w:t>anggal</w:t>
+              <w:t>tanggal</w:t>
             </w:r>
             <w:proofErr w:type="gramEnd"/>
             <w:r>
@@ -2607,17 +2577,11 @@
             </w:r>
             <w:proofErr w:type="spellStart"/>
             <w:r>
-              <w:t>t</w:t>
-            </w:r>
-            <w:r>
-              <w:t>anggal</w:t>
+              <w:t>tanggal</w:t>
             </w:r>
             <w:proofErr w:type="gramEnd"/>
             <w:r>
-              <w:t>_</w:t>
-            </w:r>
-            <w:r>
-              <w:t>implementasi</w:t>
+              <w:t>_implementasi</w:t>
             </w:r>
             <w:proofErr w:type="spellEnd"/>
             <w:r>
@@ -2627,12 +2591,6 @@
         </w:tc>
       </w:tr>
     </w:tbl>
-    <w:p/>
-    <w:p/>
-    <w:p/>
-    <w:p/>
-    <w:p/>
-    <w:p/>
     <w:p/>
     <w:p/>
     <w:p/>
@@ -2683,8 +2641,9 @@
         <w:tab/>
         <w:t>Hal: 2 / 1</w:t>
       </w:r>
-      <w:bookmarkEnd w:id="0"/>
     </w:p>
+    <w:p/>
+    <w:p/>
     <w:sectPr>
       <w:pgSz w:w="11906" w:h="16838"/>
       <w:pgMar w:top="1701" w:right="1134" w:bottom="1134" w:left="1701" w:header="709" w:footer="709" w:gutter="0"/>
@@ -3145,6 +3104,7 @@
   <w:style w:type="paragraph" w:default="1" w:styleId="Normal">
     <w:name w:val="Normal"/>
     <w:qFormat/>
+    <w:rsid w:val="00E33AE1"/>
   </w:style>
   <w:style w:type="paragraph" w:styleId="Judul1">
     <w:name w:val="heading 1"/>

</xml_diff>

<commit_message>
Update css form surat pernyataan dan hapus uppercase tombol preview & submit form usulan
</commit_message>
<xml_diff>
--- a/templates/usulan_perubahan_template.docx
+++ b/templates/usulan_perubahan_template.docx
@@ -159,17 +159,12 @@
             <w:tcW w:w="2829" w:type="dxa"/>
           </w:tcPr>
           <w:p>
-            <w:proofErr w:type="gramStart"/>
             <w:r>
               <w:t xml:space="preserve">{{ </w:t>
             </w:r>
             <w:proofErr w:type="spellStart"/>
             <w:r>
-              <w:t>no</w:t>
-            </w:r>
-            <w:proofErr w:type="gramEnd"/>
-            <w:r>
-              <w:t>_dokumen</w:t>
+              <w:t>no_dokumen</w:t>
             </w:r>
             <w:proofErr w:type="spellEnd"/>
             <w:r>
@@ -210,7 +205,6 @@
             <w:tcW w:w="2829" w:type="dxa"/>
           </w:tcPr>
           <w:p>
-            <w:proofErr w:type="gramStart"/>
             <w:r>
               <w:t xml:space="preserve">{{ </w:t>
             </w:r>
@@ -219,7 +213,6 @@
               <w:t>revisi</w:t>
             </w:r>
             <w:proofErr w:type="spellEnd"/>
-            <w:proofErr w:type="gramEnd"/>
             <w:r>
               <w:t xml:space="preserve"> }}</w:t>
             </w:r>
@@ -266,17 +259,12 @@
             <w:tcW w:w="2829" w:type="dxa"/>
           </w:tcPr>
           <w:p>
-            <w:proofErr w:type="gramStart"/>
             <w:r>
               <w:t xml:space="preserve">{{ </w:t>
             </w:r>
             <w:proofErr w:type="spellStart"/>
             <w:r>
-              <w:t>tgl</w:t>
-            </w:r>
-            <w:proofErr w:type="gramEnd"/>
-            <w:r>
-              <w:t>_efektif</w:t>
+              <w:t>tgl_efektif</w:t>
             </w:r>
             <w:proofErr w:type="spellEnd"/>
             <w:r>
@@ -433,17 +421,12 @@
             <w:gridSpan w:val="4"/>
           </w:tcPr>
           <w:p>
-            <w:proofErr w:type="gramStart"/>
             <w:r>
               <w:t xml:space="preserve">{{ </w:t>
             </w:r>
             <w:proofErr w:type="spellStart"/>
             <w:r>
-              <w:t>no</w:t>
-            </w:r>
-            <w:proofErr w:type="gramEnd"/>
-            <w:r>
-              <w:t>_usulan</w:t>
+              <w:t>no_usulan</w:t>
             </w:r>
             <w:proofErr w:type="spellEnd"/>
             <w:r>
@@ -463,18 +446,13 @@
             </w:r>
             <w:proofErr w:type="spellEnd"/>
             <w:r>
-              <w:t xml:space="preserve">: </w:t>
-            </w:r>
-            <w:proofErr w:type="gramStart"/>
-            <w:r>
-              <w:t xml:space="preserve">{{ </w:t>
+              <w:t xml:space="preserve">: {{ </w:t>
             </w:r>
             <w:proofErr w:type="spellStart"/>
             <w:r>
               <w:t>tanggal</w:t>
             </w:r>
             <w:proofErr w:type="spellEnd"/>
-            <w:proofErr w:type="gramEnd"/>
             <w:r>
               <w:t xml:space="preserve"> }}</w:t>
             </w:r>
@@ -542,7 +520,6 @@
             <w:gridSpan w:val="4"/>
           </w:tcPr>
           <w:p>
-            <w:proofErr w:type="gramStart"/>
             <w:r>
               <w:t xml:space="preserve">{{ </w:t>
             </w:r>
@@ -551,7 +528,6 @@
               <w:t>jabatan</w:t>
             </w:r>
             <w:proofErr w:type="spellEnd"/>
-            <w:proofErr w:type="gramEnd"/>
             <w:r>
               <w:t xml:space="preserve"> }}</w:t>
             </w:r>
@@ -562,7 +538,7 @@
         <w:trPr>
           <w:gridAfter w:val="1"/>
           <w:wAfter w:w="6" w:type="dxa"/>
-          <w:trHeight w:val="1281"/>
+          <w:trHeight w:val="985"/>
         </w:trPr>
         <w:tc>
           <w:tcPr>
@@ -584,19 +560,11 @@
             </w:r>
             <w:proofErr w:type="spellEnd"/>
             <w:r>
-              <w:t xml:space="preserve">: </w:t>
-            </w:r>
-            <w:proofErr w:type="gramStart"/>
-            <w:r>
-              <w:t xml:space="preserve">{{ </w:t>
-            </w:r>
-            <w:proofErr w:type="spellStart"/>
-            <w:r>
-              <w:t>deskripsi</w:t>
-            </w:r>
-            <w:proofErr w:type="gramEnd"/>
-            <w:r>
-              <w:t>_perubahan</w:t>
+              <w:t xml:space="preserve">: {{ </w:t>
+            </w:r>
+            <w:proofErr w:type="spellStart"/>
+            <w:r>
+              <w:t>deskripsi_perubahan</w:t>
             </w:r>
             <w:proofErr w:type="spellEnd"/>
             <w:r>
@@ -641,19 +609,11 @@
             </w:r>
             <w:proofErr w:type="spellEnd"/>
             <w:r>
-              <w:t xml:space="preserve">: </w:t>
-            </w:r>
-            <w:proofErr w:type="gramStart"/>
-            <w:r>
-              <w:t xml:space="preserve">{{ </w:t>
-            </w:r>
-            <w:proofErr w:type="spellStart"/>
-            <w:r>
-              <w:t>tgl</w:t>
-            </w:r>
-            <w:proofErr w:type="gramEnd"/>
-            <w:r>
-              <w:t>_dibutuhkan</w:t>
+              <w:t xml:space="preserve">: {{ </w:t>
+            </w:r>
+            <w:proofErr w:type="spellStart"/>
+            <w:r>
+              <w:t>tgl_dibutuhkan</w:t>
             </w:r>
             <w:proofErr w:type="spellEnd"/>
             <w:r>
@@ -666,7 +626,7 @@
         <w:trPr>
           <w:gridAfter w:val="1"/>
           <w:wAfter w:w="6" w:type="dxa"/>
-          <w:trHeight w:val="989"/>
+          <w:trHeight w:val="847"/>
         </w:trPr>
         <w:tc>
           <w:tcPr>
@@ -683,19 +643,11 @@
             </w:r>
             <w:proofErr w:type="spellEnd"/>
             <w:r>
-              <w:t xml:space="preserve">: </w:t>
-            </w:r>
-            <w:proofErr w:type="gramStart"/>
-            <w:r>
-              <w:t xml:space="preserve">{{ </w:t>
-            </w:r>
-            <w:proofErr w:type="spellStart"/>
-            <w:r>
-              <w:t>alasan</w:t>
-            </w:r>
-            <w:proofErr w:type="gramEnd"/>
-            <w:r>
-              <w:t>_perubahan</w:t>
+              <w:t xml:space="preserve">: {{ </w:t>
+            </w:r>
+            <w:proofErr w:type="spellStart"/>
+            <w:r>
+              <w:t>alasan_perubahan</w:t>
             </w:r>
             <w:proofErr w:type="spellEnd"/>
             <w:r>
@@ -744,29 +696,16 @@
           </w:tcPr>
           <w:p/>
           <w:p>
-            <w:proofErr w:type="gramStart"/>
             <w:r>
               <w:t xml:space="preserve">{{ </w:t>
             </w:r>
             <w:proofErr w:type="spellStart"/>
             <w:r>
-              <w:t>tanda</w:t>
-            </w:r>
-            <w:proofErr w:type="gramEnd"/>
-            <w:r>
-              <w:t>_tangan_</w:t>
-            </w:r>
-            <w:proofErr w:type="gramStart"/>
-            <w:r>
-              <w:t>pemohon</w:t>
-            </w:r>
-            <w:proofErr w:type="spellEnd"/>
-            <w:r>
-              <w:t xml:space="preserve"> }</w:t>
-            </w:r>
-            <w:proofErr w:type="gramEnd"/>
-            <w:r>
-              <w:t>}</w:t>
+              <w:t>tanda_tangan_pemohon</w:t>
+            </w:r>
+            <w:proofErr w:type="spellEnd"/>
+            <w:r>
+              <w:t xml:space="preserve"> }}</w:t>
             </w:r>
           </w:p>
           <w:p/>
@@ -1567,17 +1506,12 @@
             <w:gridSpan w:val="10"/>
           </w:tcPr>
           <w:p>
-            <w:proofErr w:type="gramStart"/>
             <w:r>
               <w:t xml:space="preserve">{{ </w:t>
             </w:r>
             <w:proofErr w:type="spellStart"/>
             <w:r>
-              <w:t>dampak</w:t>
-            </w:r>
-            <w:proofErr w:type="gramEnd"/>
-            <w:r>
-              <w:t>_produksi</w:t>
+              <w:t>dampak_produksi</w:t>
             </w:r>
             <w:proofErr w:type="spellEnd"/>
             <w:r>
@@ -1616,17 +1550,12 @@
             <w:gridSpan w:val="10"/>
           </w:tcPr>
           <w:p>
-            <w:proofErr w:type="gramStart"/>
             <w:r>
               <w:t xml:space="preserve">{{ </w:t>
             </w:r>
             <w:proofErr w:type="spellStart"/>
             <w:r>
-              <w:t>upaya</w:t>
-            </w:r>
-            <w:proofErr w:type="gramEnd"/>
-            <w:r>
-              <w:t>_diperlukan</w:t>
+              <w:t>upaya_diperlukan</w:t>
             </w:r>
             <w:proofErr w:type="spellEnd"/>
             <w:r>
@@ -1678,17 +1607,12 @@
             <w:gridSpan w:val="9"/>
           </w:tcPr>
           <w:p>
-            <w:proofErr w:type="gramStart"/>
             <w:r>
               <w:t xml:space="preserve">{{ </w:t>
             </w:r>
             <w:proofErr w:type="spellStart"/>
             <w:r>
-              <w:t>kebutuhan</w:t>
-            </w:r>
-            <w:proofErr w:type="gramEnd"/>
-            <w:r>
-              <w:t>_sdm</w:t>
+              <w:t>kebutuhan_sdm</w:t>
             </w:r>
             <w:proofErr w:type="spellEnd"/>
             <w:r>
@@ -1740,17 +1664,12 @@
             <w:gridSpan w:val="7"/>
           </w:tcPr>
           <w:p>
-            <w:proofErr w:type="gramStart"/>
             <w:r>
               <w:t xml:space="preserve">{{ </w:t>
             </w:r>
             <w:proofErr w:type="spellStart"/>
             <w:r>
-              <w:t>rencana</w:t>
-            </w:r>
-            <w:proofErr w:type="gramEnd"/>
-            <w:r>
-              <w:t>_pengujian</w:t>
+              <w:t>rencana_pengujian</w:t>
             </w:r>
             <w:proofErr w:type="spellEnd"/>
             <w:r>
@@ -2067,17 +1986,12 @@
             <w:gridSpan w:val="10"/>
           </w:tcPr>
           <w:p>
-            <w:proofErr w:type="gramStart"/>
             <w:r>
               <w:t xml:space="preserve">{{ </w:t>
             </w:r>
             <w:proofErr w:type="spellStart"/>
             <w:r>
-              <w:t>tanggal</w:t>
-            </w:r>
-            <w:proofErr w:type="gramEnd"/>
-            <w:r>
-              <w:t>_pelaksanaan</w:t>
+              <w:t>tanggal_pelaksanaan</w:t>
             </w:r>
             <w:proofErr w:type="spellEnd"/>
             <w:r>
@@ -2120,19 +2034,11 @@
             </w:r>
             <w:proofErr w:type="spellEnd"/>
             <w:r>
-              <w:t xml:space="preserve">: </w:t>
-            </w:r>
-            <w:proofErr w:type="gramStart"/>
-            <w:r>
-              <w:t xml:space="preserve">{{ </w:t>
-            </w:r>
-            <w:proofErr w:type="spellStart"/>
-            <w:r>
-              <w:t>pic</w:t>
-            </w:r>
-            <w:proofErr w:type="gramEnd"/>
-            <w:r>
-              <w:t>_pelaksana</w:t>
+              <w:t xml:space="preserve">: {{ </w:t>
+            </w:r>
+            <w:proofErr w:type="spellStart"/>
+            <w:r>
+              <w:t>pic_pelaksana</w:t>
             </w:r>
             <w:proofErr w:type="spellEnd"/>
             <w:r>
@@ -2142,7 +2048,6 @@
         </w:tc>
       </w:tr>
     </w:tbl>
-    <w:p/>
     <w:p/>
     <w:p>
       <w:bookmarkStart w:id="0" w:name="_Hlk216772573"/>
@@ -2234,29 +2139,16 @@
           </w:tcPr>
           <w:p/>
           <w:p>
-            <w:proofErr w:type="gramStart"/>
             <w:r>
               <w:t xml:space="preserve">{{ </w:t>
             </w:r>
             <w:proofErr w:type="spellStart"/>
             <w:r>
-              <w:t>tanda</w:t>
-            </w:r>
-            <w:proofErr w:type="gramEnd"/>
-            <w:r>
-              <w:t>_tangan_</w:t>
-            </w:r>
-            <w:proofErr w:type="gramStart"/>
-            <w:r>
-              <w:t>persetujuan</w:t>
-            </w:r>
-            <w:proofErr w:type="spellEnd"/>
-            <w:r>
-              <w:t xml:space="preserve"> }</w:t>
-            </w:r>
-            <w:proofErr w:type="gramEnd"/>
-            <w:r>
-              <w:t>}</w:t>
+              <w:t>tanda_tangan_persetujuan</w:t>
+            </w:r>
+            <w:proofErr w:type="spellEnd"/>
+            <w:r>
+              <w:t xml:space="preserve"> }}</w:t>
             </w:r>
           </w:p>
           <w:p/>
@@ -2385,31 +2277,15 @@
             </w:r>
             <w:proofErr w:type="spellEnd"/>
             <w:r>
-              <w:t xml:space="preserve">: </w:t>
-            </w:r>
-            <w:proofErr w:type="gramStart"/>
-            <w:r>
-              <w:t xml:space="preserve">{{ </w:t>
-            </w:r>
-            <w:proofErr w:type="spellStart"/>
-            <w:r>
-              <w:t>hasil</w:t>
-            </w:r>
-            <w:proofErr w:type="gramEnd"/>
-            <w:r>
-              <w:t>_pengujian_</w:t>
-            </w:r>
-            <w:proofErr w:type="gramStart"/>
-            <w:r>
-              <w:t>implementasi</w:t>
-            </w:r>
-            <w:proofErr w:type="spellEnd"/>
-            <w:r>
-              <w:t xml:space="preserve"> }</w:t>
-            </w:r>
-            <w:proofErr w:type="gramEnd"/>
-            <w:r>
-              <w:t>}</w:t>
+              <w:t xml:space="preserve">: {{ </w:t>
+            </w:r>
+            <w:proofErr w:type="spellStart"/>
+            <w:r>
+              <w:t>hasil_pengujian_implementasi</w:t>
+            </w:r>
+            <w:proofErr w:type="spellEnd"/>
+            <w:r>
+              <w:t xml:space="preserve"> }}</w:t>
             </w:r>
           </w:p>
           <w:p/>
@@ -2466,17 +2342,12 @@
             <w:gridSpan w:val="2"/>
           </w:tcPr>
           <w:p>
-            <w:proofErr w:type="gramStart"/>
             <w:r>
               <w:t xml:space="preserve">{{ </w:t>
             </w:r>
             <w:proofErr w:type="spellStart"/>
             <w:r>
-              <w:t>tanggal</w:t>
-            </w:r>
-            <w:proofErr w:type="gramEnd"/>
-            <w:r>
-              <w:t>_rilis</w:t>
+              <w:t>tanggal_rilis</w:t>
             </w:r>
             <w:proofErr w:type="spellEnd"/>
             <w:r>
@@ -2523,29 +2394,16 @@
           </w:tcPr>
           <w:p/>
           <w:p>
-            <w:proofErr w:type="gramStart"/>
             <w:r>
               <w:t xml:space="preserve">{{ </w:t>
             </w:r>
             <w:proofErr w:type="spellStart"/>
             <w:r>
-              <w:t>tanda</w:t>
-            </w:r>
-            <w:proofErr w:type="gramEnd"/>
-            <w:r>
-              <w:t>_tangan_</w:t>
-            </w:r>
-            <w:proofErr w:type="gramStart"/>
-            <w:r>
-              <w:t>pic</w:t>
-            </w:r>
-            <w:proofErr w:type="spellEnd"/>
-            <w:r>
-              <w:t xml:space="preserve"> }</w:t>
-            </w:r>
-            <w:proofErr w:type="gramEnd"/>
-            <w:r>
-              <w:t>}</w:t>
+              <w:t>tanda_tangan_pic</w:t>
+            </w:r>
+            <w:proofErr w:type="spellEnd"/>
+            <w:r>
+              <w:t xml:space="preserve"> }}</w:t>
             </w:r>
           </w:p>
           <w:p/>
@@ -2571,17 +2429,12 @@
             <w:tcW w:w="2687" w:type="dxa"/>
           </w:tcPr>
           <w:p>
-            <w:proofErr w:type="gramStart"/>
             <w:r>
               <w:t xml:space="preserve">{{ </w:t>
             </w:r>
             <w:proofErr w:type="spellStart"/>
             <w:r>
-              <w:t>tanggal</w:t>
-            </w:r>
-            <w:proofErr w:type="gramEnd"/>
-            <w:r>
-              <w:t>_implementasi</w:t>
+              <w:t>tanggal_implementasi</w:t>
             </w:r>
             <w:proofErr w:type="spellEnd"/>
             <w:r>
@@ -2591,8 +2444,6 @@
         </w:tc>
       </w:tr>
     </w:tbl>
-    <w:p/>
-    <w:p/>
     <w:p/>
     <w:p/>
     <w:p/>

</xml_diff>